<commit_message>
update lecture 05; add housetasks-ex.R
</commit_message>
<xml_diff>
--- a/assign/assign3.docx
+++ b/assign/assign3.docx
@@ -62,8 +62,13 @@
       </w:r>
     </w:p>
     <w:p>
-      <w:r>
-        <w:t>Often I list here some other reading</w:t>
+      <w:proofErr w:type="gramStart"/>
+      <w:r>
+        <w:t>Often</w:t>
+      </w:r>
+      <w:proofErr w:type="gramEnd"/>
+      <w:r>
+        <w:t xml:space="preserve"> I list here some other reading</w:t>
       </w:r>
       <w:r>
         <w:t>s</w:t>
@@ -117,7 +122,7 @@
           <w:rPr>
             <w:rStyle w:val="Hyperlink"/>
           </w:rPr>
-          <w:t>psyc6136@yorku.ca</w:t>
+          <w:t>psy6136@yorku.ca</w:t>
         </w:r>
       </w:hyperlink>
       <w:r>
@@ -147,7 +152,13 @@
         <w:t>DDAR</w:t>
       </w:r>
       <w:r>
-        <w:t>, Exercise 4.2.  Add: (d) Write a brief summary of how support for abortion depends on sex and status.</w:t>
+        <w:t>, Exercise 4.2</w:t>
+      </w:r>
+      <w:r>
+        <w:t xml:space="preserve"> (Abortion data)</w:t>
+      </w:r>
+      <w:r>
+        <w:t xml:space="preserve">.  </w:t>
       </w:r>
     </w:p>
     <w:p>
@@ -162,63 +173,13 @@
         <w:t>DDAR</w:t>
       </w:r>
       <w:r>
-        <w:t xml:space="preserve">, Exercise 4.4.  Add: (e) </w:t>
-      </w:r>
-      <w:r>
-        <w:t xml:space="preserve">Try one or more of the following other functions for visualizing two-way contingency tables with this data: </w:t>
-      </w:r>
-      <w:proofErr w:type="gramStart"/>
-      <w:r>
-        <w:t>plot(</w:t>
-      </w:r>
-      <w:proofErr w:type="gramEnd"/>
-      <w:r>
-        <w:t xml:space="preserve">), </w:t>
-      </w:r>
-      <w:proofErr w:type="gramStart"/>
-      <w:r>
-        <w:t>tile(</w:t>
-      </w:r>
-      <w:proofErr w:type="gramEnd"/>
-      <w:r>
-        <w:t xml:space="preserve">) </w:t>
-      </w:r>
-      <w:proofErr w:type="gramStart"/>
-      <w:r>
-        <w:t>mosaic(</w:t>
-      </w:r>
-      <w:proofErr w:type="gramEnd"/>
-      <w:r>
-        <w:t xml:space="preserve">), </w:t>
-      </w:r>
-      <w:proofErr w:type="spellStart"/>
-      <w:proofErr w:type="gramStart"/>
-      <w:r>
-        <w:t>spineplot</w:t>
-      </w:r>
-      <w:proofErr w:type="spellEnd"/>
-      <w:r>
-        <w:t>(</w:t>
-      </w:r>
-      <w:proofErr w:type="gramEnd"/>
-      <w:r>
-        <w:t xml:space="preserve">).  [For all except </w:t>
-      </w:r>
-      <w:proofErr w:type="spellStart"/>
-      <w:proofErr w:type="gramStart"/>
-      <w:r>
-        <w:t>spineplot</w:t>
-      </w:r>
-      <w:proofErr w:type="spellEnd"/>
-      <w:r>
-        <w:t>(</w:t>
-      </w:r>
-      <w:proofErr w:type="gramEnd"/>
-      <w:r>
-        <w:t xml:space="preserve">), it is useful to include the argument shade=TRUE]. </w:t>
-      </w:r>
-      <w:r>
-        <w:t xml:space="preserve"> (f) Comment on the differences among these displays for understanding the relation between visits and length of stay.</w:t>
+        <w:t>, Exercise 4.4</w:t>
+      </w:r>
+      <w:r>
+        <w:t xml:space="preserve"> &amp; 4.5 (Hospital data)</w:t>
+      </w:r>
+      <w:r>
+        <w:t xml:space="preserve">.  </w:t>
       </w:r>
     </w:p>
     <w:p>
@@ -236,36 +197,14 @@
         <w:t xml:space="preserve">: </w:t>
       </w:r>
       <w:r>
-        <w:t xml:space="preserve">Exercise 4.5. Add: (c) Compare the Kappa measures with the results from </w:t>
-      </w:r>
-      <w:proofErr w:type="spellStart"/>
-      <w:proofErr w:type="gramStart"/>
-      <w:r>
-        <w:t>assocstats</w:t>
-      </w:r>
-      <w:proofErr w:type="spellEnd"/>
-      <w:r>
-        <w:t>(</w:t>
-      </w:r>
-      <w:proofErr w:type="gramEnd"/>
-      <w:r>
-        <w:t xml:space="preserve">). What is a </w:t>
-      </w:r>
-      <w:r>
-        <w:t>reasonable</w:t>
-      </w:r>
-      <w:r>
-        <w:t xml:space="preserve"> interpretation of </w:t>
-      </w:r>
-      <w:r>
-        <w:t>each of these measures?</w:t>
-      </w:r>
-    </w:p>
-    <w:p>
-      <w:pPr>
-        <w:pStyle w:val="ListParagraph"/>
-        <w:ind w:left="360"/>
-      </w:pPr>
+        <w:t>Exercise 4.</w:t>
+      </w:r>
+      <w:r>
+        <w:t>6 (Mammograms data)</w:t>
+      </w:r>
+      <w:r>
+        <w:t xml:space="preserve"> </w:t>
+      </w:r>
     </w:p>
     <w:sectPr>
       <w:pgSz w:w="12240" w:h="15840"/>
@@ -1116,6 +1055,18 @@
       <w:u w:val="single"/>
     </w:rPr>
   </w:style>
+  <w:style w:type="character" w:styleId="UnresolvedMention">
+    <w:name w:val="Unresolved Mention"/>
+    <w:basedOn w:val="DefaultParagraphFont"/>
+    <w:uiPriority w:val="99"/>
+    <w:semiHidden/>
+    <w:unhideWhenUsed/>
+    <w:rsid w:val="0056501D"/>
+    <w:rPr>
+      <w:color w:val="605E5C"/>
+      <w:shd w:val="clear" w:color="auto" w:fill="E1DFDD"/>
+    </w:rPr>
+  </w:style>
 </w:styles>
 </file>
 

</xml_diff>